<commit_message>
PRD v4: record the Google Maps directions link
Six additions and one rewritten table row, no other paragraph touched:
the change summary on the cover, a line in Built and working, the Ticket Modal
row in 4.2, a Getting there paragraph explaining why the destination is the
coordinates and not the geocoded address, a note on the external-link convention
the feature establishes, and a Navigation row in the stack table.

Regenerated from the same script as v4 itself, so the formatting is byte-for-byte
the same everywhere the text did not change.

Co-Authored-By: Claude Opus 5 <noreply@anthropic.com>
</commit_message>
<xml_diff>
--- a/CivicPulse_PRD_v4.docx
+++ b/CivicPulse_PRD_v4.docx
@@ -406,6 +406,36 @@
           </w:p>
         </w:tc>
       </w:tr>
+      <w:tr>
+        <w:tc>
+          <w:tcPr>
+            <w:tcW w:w="1800" w:type="dxa"/>
+            <w:vAlign w:val="center"/>
+          </w:tcPr>
+          <w:p>
+            <w:pPr>
+              <w:pStyle w:val="TableTextX"/>
+            </w:pPr>
+            <w:r>
+              <w:t xml:space="preserve">Navigation</w:t>
+            </w:r>
+          </w:p>
+        </w:tc>
+        <w:tc>
+          <w:tcPr>
+            <w:tcW w:w="7200" w:type="dxa"/>
+            <w:vAlign w:val="center"/>
+          </w:tcPr>
+          <w:p>
+            <w:pPr>
+              <w:pStyle w:val="TableTextX"/>
+            </w:pPr>
+            <w:r>
+              <w:t xml:space="preserve">Ticket coordinates now link straight into Google Maps directions for the crew</w:t>
+            </w:r>
+          </w:p>
+        </w:tc>
+      </w:tr>
     </w:tbl>
     <w:p>
       <w:pPr>
@@ -496,6 +526,14 @@
       </w:pPr>
       <w:r>
         <w:t xml:space="preserve">•  Kanban tracking, manual reassignment, resolution requiring photo proof</w:t>
+      </w:r>
+    </w:p>
+    <w:p>
+      <w:pPr>
+        <w:pStyle w:val="BodyX"/>
+      </w:pPr>
+      <w:r>
+        <w:t xml:space="preserve">•  One-tap directions from a ticket to the reported location, for the crew on the way</w:t>
       </w:r>
     </w:p>
     <w:p>
@@ -2398,7 +2436,7 @@
               <w:pStyle w:val="TableTextX"/>
             </w:pPr>
             <w:r>
-              <w:t xml:space="preserve">Detail, coordinates, audit trail, and Manage Ticket — see below.</w:t>
+              <w:t xml:space="preserve">Detail, coordinates, a Google Maps directions link, audit trail, and Manage Ticket — see below.</w:t>
             </w:r>
           </w:p>
         </w:tc>
@@ -2580,6 +2618,46 @@
       <w:r>
         <w:t xml:space="preserve">•  The whole section is absent for a read-only admin, who sees the detail and the audit trail only.</w:t>
       </w:r>
+    </w:p>
+    <w:p>
+      <w:pPr>
+        <w:pStyle w:val="SpacerX"/>
+      </w:pPr>
+    </w:p>
+    <w:p>
+      <w:pPr>
+        <w:pStyle w:val="BodyX"/>
+      </w:pPr>
+      <w:r>
+        <w:rPr>
+          <w:b/>
+        </w:rPr>
+        <w:t xml:space="preserve">Getting there.</w:t>
+      </w:r>
+      <w:r>
+        <w:t xml:space="preserve"> Under the coordinates, every ticket carries a Google Maps link that opens directions rather than a dropped pin — on a phone it hands off to the Maps app and starts routing from wherever the engineer is. It is a URL, not an API: no key, no SDK, nothing to provision, which is the same constraint that chose Nominatim for geocoding and an in-browser hash over an embedding service.</w:t>
+      </w:r>
+    </w:p>
+    <w:p>
+      <w:pPr>
+        <w:pStyle w:val="BodyX"/>
+      </w:pPr>
+      <w:r>
+        <w:t xml:space="preserve">The destination is always the coordinates, never the geocoded address. The address is null whenever Nominatim finds nothing, and even when present it is a suburb-level name that would route a crew to the middle of an area rather than to the defect. The link is absent from the report form: a resident standing at the problem does not need directions to it.</w:t>
+      </w:r>
+    </w:p>
+    <w:p>
+      <w:pPr>
+        <w:pStyle w:val="NoteX"/>
+      </w:pPr>
+      <w:r>
+        <w:t xml:space="preserve">The app’s first external link, so it sets the convention — target="_blank" with rel="noopener noreferrer", and a screen-reader-only "(opens in a new tab)", because the icon cannot carry that and an unannounced new tab is disorienting.</w:t>
+      </w:r>
+    </w:p>
+    <w:p>
+      <w:pPr>
+        <w:pStyle w:val="SpacerX"/>
+      </w:pPr>
     </w:p>
     <w:p>
       <w:pPr>
@@ -3391,6 +3469,36 @@
             </w:pPr>
             <w:r>
               <w:t xml:space="preserve">OpenStreetMap Nominatim (keyless)</w:t>
+            </w:r>
+          </w:p>
+        </w:tc>
+      </w:tr>
+      <w:tr>
+        <w:tc>
+          <w:tcPr>
+            <w:tcW w:w="1800" w:type="dxa"/>
+            <w:vAlign w:val="center"/>
+          </w:tcPr>
+          <w:p>
+            <w:pPr>
+              <w:pStyle w:val="TableTextX"/>
+            </w:pPr>
+            <w:r>
+              <w:t xml:space="preserve">Navigation</w:t>
+            </w:r>
+          </w:p>
+        </w:tc>
+        <w:tc>
+          <w:tcPr>
+            <w:tcW w:w="7200" w:type="dxa"/>
+            <w:vAlign w:val="center"/>
+          </w:tcPr>
+          <w:p>
+            <w:pPr>
+              <w:pStyle w:val="TableTextX"/>
+            </w:pPr>
+            <w:r>
+              <w:t xml:space="preserve">Google Maps directions URL — a link, not an API; no key and no SDK</w:t>
             </w:r>
           </w:p>
         </w:tc>

</xml_diff>